<commit_message>
docs(product-8): spec the self-serve template upload flow (§3.3.1)
Full build spec so implementation is unambiguous: 4-step user flow (upload →
auto-detect → edit overlay → save), render+AI-detection engine, OCR path for
scanned docs, two field-anchoring methods (coordinate vs text-anchor/merge-tags)
with trade-offs, the per-template JSON schema, and RLS/legal guardrails.
Regenerated the Word doc (converter now handles fenced code blocks).

Co-Authored-By: Claude Opus 4.8 (1M context) <noreply@anthropic.com>
</commit_message>
<xml_diff>
--- a/PRODUCTS/08-helix-sign-forms.docx
+++ b/PRODUCTS/08-helix-sign-forms.docx
@@ -1417,6 +1417,617 @@
     </w:p>
     <w:p>
       <w:pPr>
+        <w:pStyle w:val="Heading4"/>
+        <w:bidi/>
+        <w:jc w:val="right"/>
+      </w:pPr>
+      <w:r>
+        <w:rPr>
+          <w:rtl/>
+          <w:cs/>
+        </w:rPr>
+        <w:t>3.3.1 העלאת תבנית עצמאית — זרימה מלאה (spec לבנייה) 🛠️</w:t>
+      </w:r>
+    </w:p>
+    <w:p>
+      <w:pPr>
+        <w:bidi/>
+        <w:jc w:val="right"/>
+      </w:pPr>
+      <w:r>
+        <w:rPr>
+          <w:b/>
+          <w:rtl/>
+          <w:cs/>
+        </w:rPr>
+        <w:t>זרימת משתמש (4 צעדים):</w:t>
+      </w:r>
+    </w:p>
+    <w:p>
+      <w:pPr>
+        <w:pStyle w:val="ListNumber"/>
+        <w:bidi/>
+        <w:jc w:val="right"/>
+      </w:pPr>
+      <w:r>
+        <w:rPr>
+          <w:b/>
+          <w:rtl/>
+          <w:cs/>
+        </w:rPr>
+        <w:t>Upload</w:t>
+      </w:r>
+      <w:r>
+        <w:rPr>
+          <w:rtl/>
+          <w:cs/>
+        </w:rPr>
+        <w:t xml:space="preserve"> — גורר/בוחר קובץ (PDF · DOCX · DOC · PNG/JPG סרוק). ולידציה: סוג, גודל (≤~20MB), מס' עמודים.</w:t>
+      </w:r>
+    </w:p>
+    <w:p>
+      <w:pPr>
+        <w:pStyle w:val="ListNumber"/>
+        <w:bidi/>
+        <w:jc w:val="right"/>
+      </w:pPr>
+      <w:r>
+        <w:rPr>
+          <w:b/>
+          <w:rtl/>
+          <w:cs/>
+        </w:rPr>
+        <w:t>Auto-detect</w:t>
+      </w:r>
+      <w:r>
+        <w:rPr>
+          <w:rtl/>
+          <w:cs/>
+        </w:rPr>
+        <w:t xml:space="preserve"> — המערכת מרנדרת ומחזירה תוך שניות תצוגה עם </w:t>
+      </w:r>
+      <w:r>
+        <w:rPr>
+          <w:b/>
+          <w:rtl/>
+          <w:cs/>
+        </w:rPr>
+        <w:t>שדות מוצעים</w:t>
+      </w:r>
+      <w:r>
+        <w:rPr>
+          <w:rtl/>
+          <w:cs/>
+        </w:rPr>
+        <w:t xml:space="preserve"> מסומנים (מיקום + סוג משוער).</w:t>
+      </w:r>
+    </w:p>
+    <w:p>
+      <w:pPr>
+        <w:pStyle w:val="ListNumber"/>
+        <w:bidi/>
+        <w:jc w:val="right"/>
+      </w:pPr>
+      <w:r>
+        <w:rPr>
+          <w:b/>
+          <w:rtl/>
+          <w:cs/>
+        </w:rPr>
+        <w:t>Edit overlay</w:t>
+      </w:r>
+      <w:r>
+        <w:rPr>
+          <w:rtl/>
+          <w:cs/>
+        </w:rPr>
+        <w:t xml:space="preserve"> — המשתמש מתקן על גבי המסמך: מוסיף/מזיז/משנה-גודל שדות (טקסט, תאריך, מספר, בחירה, checkbox, </w:t>
+      </w:r>
+      <w:r>
+        <w:rPr>
+          <w:b/>
+          <w:rtl/>
+          <w:cs/>
+        </w:rPr>
+        <w:t>חתימה</w:t>
+      </w:r>
+      <w:r>
+        <w:rPr>
+          <w:rtl/>
+          <w:cs/>
+        </w:rPr>
+        <w:t xml:space="preserve">, קובץ, תשלום). לכל שדה: </w:t>
+      </w:r>
+      <w:r>
+        <w:rPr>
+          <w:b/>
+          <w:rtl/>
+          <w:cs/>
+        </w:rPr>
+        <w:t>role</w:t>
+      </w:r>
+      <w:r>
+        <w:rPr>
+          <w:rtl/>
+          <w:cs/>
+        </w:rPr>
+        <w:t xml:space="preserve"> (שולח / חותם 1 / חותם 2...), </w:t>
+      </w:r>
+      <w:r>
+        <w:rPr>
+          <w:b/>
+          <w:rtl/>
+          <w:cs/>
+        </w:rPr>
+        <w:t>חובה/רשות</w:t>
+      </w:r>
+      <w:r>
+        <w:rPr>
+          <w:rtl/>
+          <w:cs/>
+        </w:rPr>
+        <w:t>, ואלידציה. סימון סבב-חתימה אם רב-חותמים.</w:t>
+      </w:r>
+    </w:p>
+    <w:p>
+      <w:pPr>
+        <w:pStyle w:val="ListNumber"/>
+        <w:bidi/>
+        <w:jc w:val="right"/>
+      </w:pPr>
+      <w:r>
+        <w:rPr>
+          <w:b/>
+          <w:rtl/>
+          <w:cs/>
+        </w:rPr>
+        <w:t>Save</w:t>
+      </w:r>
+      <w:r>
+        <w:rPr>
+          <w:rtl/>
+          <w:cs/>
+        </w:rPr>
+        <w:t xml:space="preserve"> — נשמר כתבנית ב</w:t>
+      </w:r>
+      <w:r>
+        <w:rPr>
+          <w:b/>
+          <w:rtl/>
+          <w:cs/>
+        </w:rPr>
+        <w:t>ספרייה הפרטית של ה-workspace</w:t>
+      </w:r>
+      <w:r>
+        <w:rPr>
+          <w:rtl/>
+          <w:cs/>
+        </w:rPr>
+        <w:t>; זמין לשליחה חוזרת בקליק.</w:t>
+      </w:r>
+    </w:p>
+    <w:p>
+      <w:pPr>
+        <w:bidi/>
+        <w:jc w:val="right"/>
+      </w:pPr>
+      <w:r>
+        <w:rPr>
+          <w:b/>
+          <w:rtl/>
+          <w:cs/>
+        </w:rPr>
+        <w:t>מנוע רינדור + זיהוי:</w:t>
+      </w:r>
+    </w:p>
+    <w:p>
+      <w:pPr>
+        <w:pStyle w:val="ListBullet"/>
+        <w:bidi/>
+        <w:jc w:val="right"/>
+      </w:pPr>
+      <w:r>
+        <w:rPr>
+          <w:b/>
+          <w:rtl/>
+          <w:cs/>
+        </w:rPr>
+        <w:t>רינדור:</w:t>
+      </w:r>
+      <w:r>
+        <w:rPr>
+          <w:rtl/>
+          <w:cs/>
+        </w:rPr>
+        <w:t xml:space="preserve"> כל קלט → PDF קנוני → מרונדר (PDF.js) כ-canvas per-עמוד; שכבת שדות מוחלטת (absolute) יושבת מעליו.</w:t>
+      </w:r>
+    </w:p>
+    <w:p>
+      <w:pPr>
+        <w:pStyle w:val="ListBullet"/>
+        <w:bidi/>
+        <w:jc w:val="right"/>
+      </w:pPr>
+      <w:r>
+        <w:rPr>
+          <w:b/>
+          <w:rtl/>
+          <w:cs/>
+        </w:rPr>
+        <w:t>זיהוי שדות (AI, §12):</w:t>
+      </w:r>
+      <w:r>
+        <w:rPr>
+          <w:rtl/>
+          <w:cs/>
+        </w:rPr>
+        <w:t xml:space="preserve"> Claude/Ollama סורק טקסט+פריסה → מזהה patterns ("_____", "שם:", "ת.ז", "תאריך", "חתימה", "סכום") → מציע סוג+מיקום. המשתמש הוא ה-source-of-truth הסופי (אישור/עריכה).</w:t>
+      </w:r>
+    </w:p>
+    <w:p>
+      <w:pPr>
+        <w:pStyle w:val="ListBullet"/>
+        <w:bidi/>
+        <w:jc w:val="right"/>
+      </w:pPr>
+      <w:r>
+        <w:rPr>
+          <w:b/>
+          <w:rtl/>
+          <w:cs/>
+        </w:rPr>
+        <w:t>OCR:</w:t>
+      </w:r>
+      <w:r>
+        <w:rPr>
+          <w:rtl/>
+          <w:cs/>
+        </w:rPr>
+        <w:t xml:space="preserve"> PDF סרוק/תמונה = ללא שכבת טקסט → </w:t>
+      </w:r>
+      <w:r>
+        <w:rPr>
+          <w:b/>
+          <w:rtl/>
+          <w:cs/>
+        </w:rPr>
+        <w:t>OCR קודם</w:t>
+      </w:r>
+      <w:r>
+        <w:rPr>
+          <w:rtl/>
+          <w:cs/>
+        </w:rPr>
+        <w:t xml:space="preserve"> (זיהוי טקסט+קואורדינטות), ואז זיהוי שדות. </w:t>
+      </w:r>
+      <w:r>
+        <w:rPr>
+          <w:b/>
+          <w:rtl/>
+          <w:cs/>
+        </w:rPr>
+        <w:t>אזהרת UX:</w:t>
+      </w:r>
+      <w:r>
+        <w:rPr>
+          <w:rtl/>
+          <w:cs/>
+        </w:rPr>
+        <w:t xml:space="preserve"> "המסמך נסרק — הזיהוי עשוי להיות פחות מדויק."</w:t>
+      </w:r>
+    </w:p>
+    <w:p>
+      <w:pPr>
+        <w:bidi/>
+        <w:jc w:val="right"/>
+      </w:pPr>
+      <w:r>
+        <w:rPr>
+          <w:b/>
+          <w:rtl/>
+          <w:cs/>
+        </w:rPr>
+        <w:t>שתי שיטות עיגון שדות (תמיכה בשתיהן):</w:t>
+      </w:r>
+    </w:p>
+    <w:tbl>
+      <w:tblPr>
+        <w:tblStyle w:val="TableGrid"/>
+        <w:tblW w:type="auto" w:w="0"/>
+        <w:tblLook w:firstColumn="1" w:firstRow="1" w:lastColumn="0" w:lastRow="0" w:noHBand="0" w:noVBand="1" w:val="04A0"/>
+        <w:bidiVisual/>
+      </w:tblPr>
+      <w:tblGrid>
+        <w:gridCol w:w="2880"/>
+        <w:gridCol w:w="2880"/>
+        <w:gridCol w:w="2880"/>
+      </w:tblGrid>
+      <w:tr>
+        <w:tc>
+          <w:tcPr>
+            <w:tcW w:type="dxa" w:w="2880"/>
+          </w:tcPr>
+          <w:p>
+            <w:pPr>
+              <w:bidi/>
+              <w:jc w:val="right"/>
+            </w:pPr>
+            <w:r>
+              <w:rPr>
+                <w:b/>
+                <w:rtl/>
+                <w:cs/>
+              </w:rPr>
+              <w:t>שיטה</w:t>
+            </w:r>
+          </w:p>
+        </w:tc>
+        <w:tc>
+          <w:tcPr>
+            <w:tcW w:type="dxa" w:w="2880"/>
+          </w:tcPr>
+          <w:p>
+            <w:pPr>
+              <w:bidi/>
+              <w:jc w:val="right"/>
+            </w:pPr>
+            <w:r>
+              <w:rPr>
+                <w:b/>
+                <w:rtl/>
+                <w:cs/>
+              </w:rPr>
+              <w:t>מתי</w:t>
+            </w:r>
+          </w:p>
+        </w:tc>
+        <w:tc>
+          <w:tcPr>
+            <w:tcW w:type="dxa" w:w="2880"/>
+          </w:tcPr>
+          <w:p>
+            <w:pPr>
+              <w:bidi/>
+              <w:jc w:val="right"/>
+            </w:pPr>
+            <w:r>
+              <w:rPr>
+                <w:b/>
+                <w:rtl/>
+                <w:cs/>
+              </w:rPr>
+              <w:t>trade-off</w:t>
+            </w:r>
+          </w:p>
+        </w:tc>
+      </w:tr>
+      <w:tr>
+        <w:tc>
+          <w:tcPr>
+            <w:tcW w:type="dxa" w:w="2880"/>
+          </w:tcPr>
+          <w:p>
+            <w:pPr>
+              <w:bidi/>
+              <w:jc w:val="right"/>
+            </w:pPr>
+            <w:r>
+              <w:rPr>
+                <w:b/>
+                <w:rtl/>
+                <w:cs/>
+              </w:rPr>
+              <w:t>קואורדינטה (x/y/page)</w:t>
+            </w:r>
+            <w:r>
+              <w:rPr>
+                <w:rtl/>
+                <w:cs/>
+              </w:rPr>
+              <w:t xml:space="preserve"> — ברירת מחדל</w:t>
+            </w:r>
+          </w:p>
+        </w:tc>
+        <w:tc>
+          <w:tcPr>
+            <w:tcW w:type="dxa" w:w="2880"/>
+          </w:tcPr>
+          <w:p>
+            <w:pPr>
+              <w:bidi/>
+              <w:jc w:val="right"/>
+            </w:pPr>
+            <w:r>
+              <w:rPr>
+                <w:rtl/>
+                <w:cs/>
+              </w:rPr>
+              <w:t>PDF פריסה קבועה</w:t>
+            </w:r>
+          </w:p>
+        </w:tc>
+        <w:tc>
+          <w:tcPr>
+            <w:tcW w:type="dxa" w:w="2880"/>
+          </w:tcPr>
+          <w:p>
+            <w:pPr>
+              <w:bidi/>
+              <w:jc w:val="right"/>
+            </w:pPr>
+            <w:r>
+              <w:rPr>
+                <w:rtl/>
+                <w:cs/>
+              </w:rPr>
+              <w:t>מדויק ויזואלית · נשבר אם התוכן זז</w:t>
+            </w:r>
+          </w:p>
+        </w:tc>
+      </w:tr>
+      <w:tr>
+        <w:tc>
+          <w:tcPr>
+            <w:tcW w:type="dxa" w:w="2880"/>
+          </w:tcPr>
+          <w:p>
+            <w:pPr>
+              <w:bidi/>
+              <w:jc w:val="right"/>
+            </w:pPr>
+            <w:r>
+              <w:rPr>
+                <w:b/>
+                <w:rtl/>
+                <w:cs/>
+              </w:rPr>
+              <w:t>עוגן-טקסט / merge-tags</w:t>
+            </w:r>
+            <w:r>
+              <w:rPr>
+                <w:rtl/>
+                <w:cs/>
+              </w:rPr>
+              <w:t xml:space="preserve"> ({{שם_לקוח}}, "חתום כאן")</w:t>
+            </w:r>
+          </w:p>
+        </w:tc>
+        <w:tc>
+          <w:tcPr>
+            <w:tcW w:type="dxa" w:w="2880"/>
+          </w:tcPr>
+          <w:p>
+            <w:pPr>
+              <w:bidi/>
+              <w:jc w:val="right"/>
+            </w:pPr>
+            <w:r>
+              <w:rPr>
+                <w:rtl/>
+                <w:cs/>
+              </w:rPr>
+              <w:t>DOCX זורם / מסמך דינמי</w:t>
+            </w:r>
+          </w:p>
+        </w:tc>
+        <w:tc>
+          <w:tcPr>
+            <w:tcW w:type="dxa" w:w="2880"/>
+          </w:tcPr>
+          <w:p>
+            <w:pPr>
+              <w:bidi/>
+              <w:jc w:val="right"/>
+            </w:pPr>
+            <w:r>
+              <w:rPr>
+                <w:rtl/>
+                <w:cs/>
+              </w:rPr>
+              <w:t>עמיד לשינוי אורך · דורש סימון עוגנים · מתחבר ל§3.2 (מיזוג נתונים)</w:t>
+            </w:r>
+          </w:p>
+        </w:tc>
+      </w:tr>
+    </w:tbl>
+    <w:p>
+      <w:pPr>
+        <w:bidi/>
+        <w:jc w:val="right"/>
+      </w:pPr>
+      <w:r>
+        <w:rPr>
+          <w:b/>
+          <w:rtl/>
+          <w:cs/>
+        </w:rPr>
+        <w:t>מודל נתונים (schema per-תבנית):</w:t>
+      </w:r>
+      <w:r>
+        <w:rPr>
+          <w:rtl/>
+          <w:cs/>
+        </w:rPr>
+        <w:t xml:space="preserve"> נשמר ב-templates.body כ-JSON:</w:t>
+      </w:r>
+    </w:p>
+    <w:p>
+      <w:pPr>
+        <w:jc w:val="left"/>
+      </w:pPr>
+      <w:r>
+        <w:rPr>
+          <w:rFonts w:ascii="Consolas" w:hAnsi="Consolas"/>
+          <w:color w:val="333333"/>
+          <w:sz w:val="18"/>
+        </w:rPr>
+        <w:t>{ file_url, pages, anchor_mode: "coord"|"text",</w:t>
+      </w:r>
+    </w:p>
+    <w:p>
+      <w:pPr>
+        <w:jc w:val="left"/>
+      </w:pPr>
+      <w:r>
+        <w:rPr>
+          <w:rFonts w:ascii="Consolas" w:hAnsi="Consolas"/>
+          <w:color w:val="333333"/>
+          <w:sz w:val="18"/>
+        </w:rPr>
+        <w:t xml:space="preserve">  fields: [{ id, type, page, x, y, w, h | anchor, role, required, validation, label }] }</w:t>
+      </w:r>
+    </w:p>
+    <w:p>
+      <w:pPr>
+        <w:bidi/>
+        <w:jc w:val="right"/>
+      </w:pPr>
+      <w:r>
+        <w:rPr>
+          <w:rtl/>
+          <w:cs/>
+        </w:rPr>
+        <w:t>בשליחה: המנוע מלביש את ה-fields על ה-PDF → מסמך חתימה חי. קובץ המקור ב-Supabase Storage; ה-schema בטבלת templates (§5).</w:t>
+      </w:r>
+    </w:p>
+    <w:p>
+      <w:pPr>
+        <w:bidi/>
+        <w:jc w:val="right"/>
+      </w:pPr>
+      <w:r>
+        <w:rPr>
+          <w:b/>
+          <w:rtl/>
+          <w:cs/>
+        </w:rPr>
+        <w:t>Guardrails:</w:t>
+      </w:r>
+      <w:r>
+        <w:rPr>
+          <w:rtl/>
+          <w:cs/>
+        </w:rPr>
+        <w:t xml:space="preserve"> תבנית פרטית = RLS per-workspace (לא נחשפת לאחרים) · תבניות מועלות </w:t>
+      </w:r>
+      <w:r>
+        <w:rPr>
+          <w:b/>
+          <w:rtl/>
+          <w:cs/>
+        </w:rPr>
+        <w:t>לא</w:t>
+      </w:r>
+      <w:r>
+        <w:rPr>
+          <w:rtl/>
+          <w:cs/>
+        </w:rPr>
+        <w:t xml:space="preserve"> נכנסות לספרייה הגלובלית המשותפת · disclaimer משפטי חל גם עליהן (§10).</w:t>
+      </w:r>
+    </w:p>
+    <w:p>
+      <w:pPr>
         <w:pStyle w:val="Heading3"/>
         <w:bidi/>
         <w:jc w:val="right"/>

</xml_diff>

<commit_message>
docs(product-8): spec Send & Sign flow (§3.4.1) and signature engine (§3.5.1)
Build-level specs matching §3.3.1's depth:
- §3.4.1 Send & Sign: document state machine (draft→sent→viewed→in_progress→
  completed + declined/expired/voided), 5-step flow (compose→dispatch→signer→
  orchestration→completion), tokenized no-login signing links, sequential vs
  parallel orchestration, cron dispatch/reminders/expiry, real-time tracking.
- §3.5.1 Signature engine: Capture→Bind→Seal→Verify, three capture modes,
  identity+hash binding, SHA-256/PAdES tamper-seal, public verify endpoint,
  per-level implementation (secure/KYC/QES-via-ComSign), Certificate of
  Completion, eIDAS + Israeli 2001-law alignment.
- Align §5 data model to the new fields (doc_hash, auth_method, cert_ref,
  sign_token, expanded status enum, template source/anchor_mode).
Regenerated Word doc.

Co-Authored-By: Claude Opus 4.8 (1M context) <noreply@anthropic.com>
</commit_message>
<xml_diff>
--- a/PRODUCTS/08-helix-sign-forms.docx
+++ b/PRODUCTS/08-helix-sign-forms.docx
@@ -2152,6 +2152,432 @@
     </w:p>
     <w:p>
       <w:pPr>
+        <w:pStyle w:val="Heading4"/>
+        <w:bidi/>
+        <w:jc w:val="right"/>
+      </w:pPr>
+      <w:r>
+        <w:rPr>
+          <w:rtl/>
+          <w:cs/>
+        </w:rPr>
+        <w:t>3.4.1 Send &amp; Sign — זרימה מלאה (spec לבנייה) 🛠️</w:t>
+      </w:r>
+    </w:p>
+    <w:p>
+      <w:pPr>
+        <w:bidi/>
+        <w:jc w:val="right"/>
+      </w:pPr>
+      <w:r>
+        <w:rPr>
+          <w:b/>
+          <w:rtl/>
+          <w:cs/>
+        </w:rPr>
+        <w:t>מכונת מצבים של מסמך:</w:t>
+      </w:r>
+      <w:r>
+        <w:rPr>
+          <w:rtl/>
+          <w:cs/>
+        </w:rPr>
+        <w:t xml:space="preserve"> draft → sent → viewed → in_progress → completed · ענפים: declined (חותם דחה) · expired (עבר תוקף) · voided (השולח ביטל).</w:t>
+      </w:r>
+    </w:p>
+    <w:p>
+      <w:pPr>
+        <w:bidi/>
+        <w:jc w:val="right"/>
+      </w:pPr>
+      <w:r>
+        <w:rPr>
+          <w:b/>
+          <w:rtl/>
+          <w:cs/>
+        </w:rPr>
+        <w:t>זרימה (5 שלבים):</w:t>
+      </w:r>
+    </w:p>
+    <w:p>
+      <w:pPr>
+        <w:pStyle w:val="ListNumber"/>
+        <w:bidi/>
+        <w:jc w:val="right"/>
+      </w:pPr>
+      <w:r>
+        <w:rPr>
+          <w:b/>
+          <w:rtl/>
+          <w:cs/>
+        </w:rPr>
+        <w:t>Compose</w:t>
+      </w:r>
+      <w:r>
+        <w:rPr>
+          <w:rtl/>
+          <w:cs/>
+        </w:rPr>
+        <w:t xml:space="preserve"> — בוחר תבנית/מסמך → ממלא שדות-שולח / ממזג נתונים → מוסיף </w:t>
+      </w:r>
+      <w:r>
+        <w:rPr>
+          <w:b/>
+          <w:rtl/>
+          <w:cs/>
+        </w:rPr>
+        <w:t>חותמים</w:t>
+      </w:r>
+      <w:r>
+        <w:rPr>
+          <w:rtl/>
+          <w:cs/>
+        </w:rPr>
+        <w:t xml:space="preserve">: לכל חותם שם · ערוץ (מייל/SMS/וואטסאפ) · order · sign_level (§3.5). מגדיר </w:t>
+      </w:r>
+      <w:r>
+        <w:rPr>
+          <w:b/>
+          <w:rtl/>
+          <w:cs/>
+        </w:rPr>
+        <w:t>תוקף</w:t>
+      </w:r>
+      <w:r>
+        <w:rPr>
+          <w:rtl/>
+          <w:cs/>
+        </w:rPr>
+        <w:t xml:space="preserve"> (למשל 14 יום) ו</w:t>
+      </w:r>
+      <w:r>
+        <w:rPr>
+          <w:b/>
+          <w:rtl/>
+          <w:cs/>
+        </w:rPr>
+        <w:t>תזכורות</w:t>
+      </w:r>
+      <w:r>
+        <w:rPr>
+          <w:rtl/>
+          <w:cs/>
+        </w:rPr>
+        <w:t xml:space="preserve"> (מתי/כל כמה).</w:t>
+      </w:r>
+    </w:p>
+    <w:p>
+      <w:pPr>
+        <w:pStyle w:val="ListNumber"/>
+        <w:bidi/>
+        <w:jc w:val="right"/>
+      </w:pPr>
+      <w:r>
+        <w:rPr>
+          <w:b/>
+          <w:rtl/>
+          <w:cs/>
+        </w:rPr>
+        <w:t>Dispatch</w:t>
+      </w:r>
+      <w:r>
+        <w:rPr>
+          <w:rtl/>
+          <w:cs/>
+        </w:rPr>
+        <w:t xml:space="preserve"> — לכל חותם נוצר </w:t>
+      </w:r>
+      <w:r>
+        <w:rPr>
+          <w:b/>
+          <w:rtl/>
+          <w:cs/>
+        </w:rPr>
+        <w:t>קישור-חתימה ייחודי מטוקן</w:t>
+      </w:r>
+      <w:r>
+        <w:rPr>
+          <w:rtl/>
+          <w:cs/>
+        </w:rPr>
+        <w:t xml:space="preserve"> (JWT חתום, חד-פעמי, תוקף) — </w:t>
+      </w:r>
+      <w:r>
+        <w:rPr>
+          <w:b/>
+          <w:rtl/>
+          <w:cs/>
+        </w:rPr>
+        <w:t>ללא צורך בחשבון/התחברות</w:t>
+      </w:r>
+      <w:r>
+        <w:rPr>
+          <w:rtl/>
+          <w:cs/>
+        </w:rPr>
+        <w:t>. נשלח בערוץ שנבחר (וואטסאפ = תבנית utility מאושרת, §30A, חלון 24 ש').</w:t>
+      </w:r>
+    </w:p>
+    <w:p>
+      <w:pPr>
+        <w:pStyle w:val="ListNumber"/>
+        <w:bidi/>
+        <w:jc w:val="right"/>
+      </w:pPr>
+      <w:r>
+        <w:rPr>
+          <w:b/>
+          <w:rtl/>
+          <w:cs/>
+        </w:rPr>
+        <w:t>Signer experience</w:t>
+      </w:r>
+      <w:r>
+        <w:rPr>
+          <w:rtl/>
+          <w:cs/>
+        </w:rPr>
+        <w:t xml:space="preserve"> — פותח קישור → </w:t>
+      </w:r>
+      <w:r>
+        <w:rPr>
+          <w:b/>
+          <w:rtl/>
+          <w:cs/>
+        </w:rPr>
+        <w:t>gate לפי sign_level</w:t>
+      </w:r>
+      <w:r>
+        <w:rPr>
+          <w:rtl/>
+          <w:cs/>
+        </w:rPr>
+        <w:t xml:space="preserve"> (הסכמה/OTP/KYC) → מילוי מודרך (שדות חובה נאכפים — אי-אפשר לחתום לפני מילוי+צירופים) → </w:t>
+      </w:r>
+      <w:r>
+        <w:rPr>
+          <w:b/>
+          <w:rtl/>
+          <w:cs/>
+        </w:rPr>
+        <w:t>לכידת חתימה</w:t>
+      </w:r>
+      <w:r>
+        <w:rPr>
+          <w:rtl/>
+          <w:cs/>
+        </w:rPr>
+        <w:t xml:space="preserve"> (§3.5.1) → שליחה.</w:t>
+      </w:r>
+    </w:p>
+    <w:p>
+      <w:pPr>
+        <w:pStyle w:val="ListNumber"/>
+        <w:bidi/>
+        <w:jc w:val="right"/>
+      </w:pPr>
+      <w:r>
+        <w:rPr>
+          <w:b/>
+          <w:rtl/>
+          <w:cs/>
+        </w:rPr>
+        <w:t>Orchestration</w:t>
+      </w:r>
+      <w:r>
+        <w:rPr>
+          <w:rtl/>
+          <w:cs/>
+        </w:rPr>
+        <w:t xml:space="preserve"> — </w:t>
+      </w:r>
+      <w:r>
+        <w:rPr>
+          <w:b/>
+          <w:rtl/>
+          <w:cs/>
+        </w:rPr>
+        <w:t>סדרתי:</w:t>
+      </w:r>
+      <w:r>
+        <w:rPr>
+          <w:rtl/>
+          <w:cs/>
+        </w:rPr>
+        <w:t xml:space="preserve"> חותם N+1 מקבל קישור רק אחרי ש-N חתם. </w:t>
+      </w:r>
+      <w:r>
+        <w:rPr>
+          <w:b/>
+          <w:rtl/>
+          <w:cs/>
+        </w:rPr>
+        <w:t>מקבילי:</w:t>
+      </w:r>
+      <w:r>
+        <w:rPr>
+          <w:rtl/>
+          <w:cs/>
+        </w:rPr>
+        <w:t xml:space="preserve"> כולם בו-זמנית. טיפול ב-declined/expired → עצירה + התראה לשולח.</w:t>
+      </w:r>
+    </w:p>
+    <w:p>
+      <w:pPr>
+        <w:pStyle w:val="ListNumber"/>
+        <w:bidi/>
+        <w:jc w:val="right"/>
+      </w:pPr>
+      <w:r>
+        <w:rPr>
+          <w:b/>
+          <w:rtl/>
+          <w:cs/>
+        </w:rPr>
+        <w:t>Completion</w:t>
+      </w:r>
+      <w:r>
+        <w:rPr>
+          <w:rtl/>
+          <w:cs/>
+        </w:rPr>
+        <w:t xml:space="preserve"> — הרכבת PDF סופי + </w:t>
+      </w:r>
+      <w:r>
+        <w:rPr>
+          <w:b/>
+          <w:rtl/>
+          <w:cs/>
+        </w:rPr>
+        <w:t>tamper-seal + Certificate of Completion + audit trail</w:t>
+      </w:r>
+      <w:r>
+        <w:rPr>
+          <w:rtl/>
+          <w:cs/>
+        </w:rPr>
+        <w:t xml:space="preserve"> (§3.5.1) → מסירה לכל הצדדים (מייל/וואטסאפ) + שמירה בכספת (§3.7).</w:t>
+      </w:r>
+    </w:p>
+    <w:p>
+      <w:pPr>
+        <w:bidi/>
+        <w:jc w:val="right"/>
+      </w:pPr>
+      <w:r>
+        <w:rPr>
+          <w:b/>
+          <w:rtl/>
+          <w:cs/>
+        </w:rPr>
+        <w:t>טכני:</w:t>
+      </w:r>
+    </w:p>
+    <w:p>
+      <w:pPr>
+        <w:pStyle w:val="ListBullet"/>
+        <w:bidi/>
+        <w:jc w:val="right"/>
+      </w:pPr>
+      <w:r>
+        <w:rPr>
+          <w:b/>
+          <w:rtl/>
+          <w:cs/>
+        </w:rPr>
+        <w:t>קישורי חתימה</w:t>
+      </w:r>
+      <w:r>
+        <w:rPr>
+          <w:rtl/>
+          <w:cs/>
+        </w:rPr>
+        <w:t xml:space="preserve"> = JWT חד-מטרתיים, תוקף + rate-limit; כל פתיחה/פעולה מתועדת (signature_events).</w:t>
+      </w:r>
+    </w:p>
+    <w:p>
+      <w:pPr>
+        <w:pStyle w:val="ListBullet"/>
+        <w:bidi/>
+        <w:jc w:val="right"/>
+      </w:pPr>
+      <w:r>
+        <w:rPr>
+          <w:b/>
+          <w:rtl/>
+          <w:cs/>
+        </w:rPr>
+        <w:t>Dispatch + תזכורות + פקיעה</w:t>
+      </w:r>
+      <w:r>
+        <w:rPr>
+          <w:rtl/>
+          <w:cs/>
+        </w:rPr>
+        <w:t xml:space="preserve"> = edge functions + </w:t>
+      </w:r>
+      <w:r>
+        <w:rPr>
+          <w:b/>
+          <w:rtl/>
+          <w:cs/>
+        </w:rPr>
+        <w:t>cron</w:t>
+      </w:r>
+      <w:r>
+        <w:rPr>
+          <w:rtl/>
+          <w:cs/>
+        </w:rPr>
+        <w:t xml:space="preserve"> (--no-verify-jwt) על מנוע ההפצה המשותף.</w:t>
+      </w:r>
+    </w:p>
+    <w:p>
+      <w:pPr>
+        <w:pStyle w:val="ListBullet"/>
+        <w:bidi/>
+        <w:jc w:val="right"/>
+      </w:pPr>
+      <w:r>
+        <w:rPr>
+          <w:b/>
+          <w:rtl/>
+          <w:cs/>
+        </w:rPr>
+        <w:t>Tracking בזמן אמת:</w:t>
+      </w:r>
+      <w:r>
+        <w:rPr>
+          <w:rtl/>
+          <w:cs/>
+        </w:rPr>
+        <w:t xml:space="preserve"> webhook per-event → עדכון סטטוס בדשבורד; פעולות שולח: resend, void, שכפול.</w:t>
+      </w:r>
+    </w:p>
+    <w:p>
+      <w:pPr>
+        <w:pStyle w:val="ListBullet"/>
+        <w:bidi/>
+        <w:jc w:val="right"/>
+      </w:pPr>
+      <w:r>
+        <w:rPr>
+          <w:b/>
+          <w:rtl/>
+          <w:cs/>
+        </w:rPr>
+        <w:t>גישה נכנסת:</w:t>
+      </w:r>
+      <w:r>
+        <w:rPr>
+          <w:rtl/>
+          <w:cs/>
+        </w:rPr>
+        <w:t xml:space="preserve"> "שלח NDA ל-050..." בוואטסאפ → יוצר+שולח (§3.8, HITL).</w:t>
+      </w:r>
+    </w:p>
+    <w:p>
+      <w:pPr>
         <w:pStyle w:val="Heading3"/>
         <w:bidi/>
         <w:jc w:val="right"/>
@@ -2498,6 +2924,467 @@
     </w:tbl>
     <w:p>
       <w:pPr>
+        <w:pStyle w:val="Heading4"/>
+        <w:bidi/>
+        <w:jc w:val="right"/>
+      </w:pPr>
+      <w:r>
+        <w:rPr>
+          <w:rtl/>
+          <w:cs/>
+        </w:rPr>
+        <w:t>3.5.1 מנוע החתימה — זרימה מלאה (spec לבנייה) 🛠️</w:t>
+      </w:r>
+    </w:p>
+    <w:p>
+      <w:pPr>
+        <w:bidi/>
+        <w:jc w:val="right"/>
+      </w:pPr>
+      <w:r>
+        <w:rPr>
+          <w:b/>
+          <w:rtl/>
+          <w:cs/>
+        </w:rPr>
+        <w:t>4 שלבי-ליבה:</w:t>
+      </w:r>
+      <w:r>
+        <w:rPr>
+          <w:rtl/>
+          <w:cs/>
+        </w:rPr>
+        <w:t xml:space="preserve"> Capture → Bind → Seal → Verify.</w:t>
+      </w:r>
+    </w:p>
+    <w:p>
+      <w:pPr>
+        <w:pStyle w:val="ListNumber"/>
+        <w:bidi/>
+        <w:jc w:val="right"/>
+      </w:pPr>
+      <w:r>
+        <w:rPr>
+          <w:b/>
+          <w:rtl/>
+          <w:cs/>
+        </w:rPr>
+        <w:t>Capture (לכידה)</w:t>
+      </w:r>
+      <w:r>
+        <w:rPr>
+          <w:rtl/>
+          <w:cs/>
+        </w:rPr>
+        <w:t xml:space="preserve"> — 3 מצבים per-חותם: </w:t>
+      </w:r>
+      <w:r>
+        <w:rPr>
+          <w:b/>
+          <w:rtl/>
+          <w:cs/>
+        </w:rPr>
+        <w:t>ציור</w:t>
+      </w:r>
+      <w:r>
+        <w:rPr>
+          <w:rtl/>
+          <w:cs/>
+        </w:rPr>
+        <w:t xml:space="preserve"> (canvas אצבע/עכבר) · </w:t>
+      </w:r>
+      <w:r>
+        <w:rPr>
+          <w:b/>
+          <w:rtl/>
+          <w:cs/>
+        </w:rPr>
+        <w:t>הקלדה</w:t>
+      </w:r>
+      <w:r>
+        <w:rPr>
+          <w:rtl/>
+          <w:cs/>
+        </w:rPr>
+        <w:t xml:space="preserve"> (שם → פונט חתימה) · </w:t>
+      </w:r>
+      <w:r>
+        <w:rPr>
+          <w:b/>
+          <w:rtl/>
+          <w:cs/>
+        </w:rPr>
+        <w:t>העלאת תמונה</w:t>
+      </w:r>
+      <w:r>
+        <w:rPr>
+          <w:rtl/>
+          <w:cs/>
+        </w:rPr>
+        <w:t>. נשמר כ-vector/PNG.</w:t>
+      </w:r>
+    </w:p>
+    <w:p>
+      <w:pPr>
+        <w:pStyle w:val="ListNumber"/>
+        <w:bidi/>
+        <w:jc w:val="right"/>
+      </w:pPr>
+      <w:r>
+        <w:rPr>
+          <w:b/>
+          <w:rtl/>
+          <w:cs/>
+        </w:rPr>
+        <w:t>Bind (קשירה)</w:t>
+      </w:r>
+      <w:r>
+        <w:rPr>
+          <w:rtl/>
+          <w:cs/>
+        </w:rPr>
+        <w:t xml:space="preserve"> — כל חתימה נקשרת ל: </w:t>
+      </w:r>
+      <w:r>
+        <w:rPr>
+          <w:b/>
+          <w:rtl/>
+          <w:cs/>
+        </w:rPr>
+        <w:t>זהות החותם</w:t>
+      </w:r>
+      <w:r>
+        <w:rPr>
+          <w:rtl/>
+          <w:cs/>
+        </w:rPr>
+        <w:t xml:space="preserve"> (email/phone + auth method לפי level) · </w:t>
+      </w:r>
+      <w:r>
+        <w:rPr>
+          <w:b/>
+          <w:rtl/>
+          <w:cs/>
+        </w:rPr>
+        <w:t>hash של המסמך</w:t>
+      </w:r>
+      <w:r>
+        <w:rPr>
+          <w:rtl/>
+          <w:cs/>
+        </w:rPr>
+        <w:t xml:space="preserve"> ברגע החתימה · </w:t>
+      </w:r>
+      <w:r>
+        <w:rPr>
+          <w:b/>
+          <w:rtl/>
+          <w:cs/>
+        </w:rPr>
+        <w:t>timestamp · IP · user-agent/device</w:t>
+      </w:r>
+      <w:r>
+        <w:rPr>
+          <w:rtl/>
+          <w:cs/>
+        </w:rPr>
+        <w:t>. זו הראיה שהחותם הספציפי חתם על *התוכן הזה*.</w:t>
+      </w:r>
+    </w:p>
+    <w:p>
+      <w:pPr>
+        <w:pStyle w:val="ListNumber"/>
+        <w:bidi/>
+        <w:jc w:val="right"/>
+      </w:pPr>
+      <w:r>
+        <w:rPr>
+          <w:b/>
+          <w:rtl/>
+          <w:cs/>
+        </w:rPr>
+        <w:t>Seal (איטום)</w:t>
+      </w:r>
+      <w:r>
+        <w:rPr>
+          <w:rtl/>
+          <w:cs/>
+        </w:rPr>
+        <w:t xml:space="preserve"> — על המסמך הסופי: </w:t>
+      </w:r>
+      <w:r>
+        <w:rPr>
+          <w:b/>
+          <w:rtl/>
+          <w:cs/>
+        </w:rPr>
+        <w:t>SHA-256 hash</w:t>
+      </w:r>
+      <w:r>
+        <w:rPr>
+          <w:rtl/>
+          <w:cs/>
+        </w:rPr>
+        <w:t xml:space="preserve"> של ה-PDF; ברמות גבוהות — </w:t>
+      </w:r>
+      <w:r>
+        <w:rPr>
+          <w:b/>
+          <w:rtl/>
+          <w:cs/>
+        </w:rPr>
+        <w:t>חתימה דיגיטלית משובצת בתקן PAdES</w:t>
+      </w:r>
+      <w:r>
+        <w:rPr>
+          <w:rtl/>
+          <w:cs/>
+        </w:rPr>
+        <w:t xml:space="preserve"> על ה-PDF. כל שינוי אחרי החתימה → ה-hash לא מסתדר → </w:t>
+      </w:r>
+      <w:r>
+        <w:rPr>
+          <w:b/>
+          <w:rtl/>
+          <w:cs/>
+        </w:rPr>
+        <w:t>tamper-evident</w:t>
+      </w:r>
+      <w:r>
+        <w:rPr>
+          <w:rtl/>
+          <w:cs/>
+        </w:rPr>
+        <w:t>. ה-hash נשמר ב-signatures.</w:t>
+      </w:r>
+    </w:p>
+    <w:p>
+      <w:pPr>
+        <w:pStyle w:val="ListNumber"/>
+        <w:bidi/>
+        <w:jc w:val="right"/>
+      </w:pPr>
+      <w:r>
+        <w:rPr>
+          <w:b/>
+          <w:rtl/>
+          <w:cs/>
+        </w:rPr>
+        <w:t>Verify (אימות)</w:t>
+      </w:r>
+      <w:r>
+        <w:rPr>
+          <w:rtl/>
+          <w:cs/>
+        </w:rPr>
+        <w:t xml:space="preserve"> — עמוד/endpoint ציבורי: מעלים PDF חתום → המערכת </w:t>
+      </w:r>
+      <w:r>
+        <w:rPr>
+          <w:b/>
+          <w:rtl/>
+          <w:cs/>
+        </w:rPr>
+        <w:t>מחשבת מחדש hash</w:t>
+      </w:r>
+      <w:r>
+        <w:rPr>
+          <w:rtl/>
+          <w:cs/>
+        </w:rPr>
+        <w:t xml:space="preserve"> ומשווה → מציגה </w:t>
+      </w:r>
+      <w:r>
+        <w:rPr>
+          <w:b/>
+          <w:rtl/>
+          <w:cs/>
+        </w:rPr>
+        <w:t>תקף/שונה</w:t>
+      </w:r>
+      <w:r>
+        <w:rPr>
+          <w:rtl/>
+          <w:cs/>
+        </w:rPr>
+        <w:t xml:space="preserve"> + audit trail מלא. מאפשר לצד ג' (עו"ד/בימ"ש) לאמת עצמאית.</w:t>
+      </w:r>
+    </w:p>
+    <w:p>
+      <w:pPr>
+        <w:bidi/>
+        <w:jc w:val="right"/>
+      </w:pPr>
+      <w:r>
+        <w:rPr>
+          <w:b/>
+          <w:rtl/>
+          <w:cs/>
+        </w:rPr>
+        <w:t>מימוש 3 הרמות (מעל אותו core):</w:t>
+      </w:r>
+    </w:p>
+    <w:p>
+      <w:pPr>
+        <w:pStyle w:val="ListBullet"/>
+        <w:bidi/>
+        <w:jc w:val="right"/>
+      </w:pPr>
+      <w:r>
+        <w:rPr>
+          <w:b/>
+          <w:rtl/>
+          <w:cs/>
+        </w:rPr>
+        <w:t>רגילה מאובטחת</w:t>
+      </w:r>
+      <w:r>
+        <w:rPr>
+          <w:rtl/>
+          <w:cs/>
+        </w:rPr>
+        <w:t xml:space="preserve"> — Capture+Bind+Seal (hash) + audit. עצמאי. קבילה לפי חוק 2001 (חתימה "מאובטחת").</w:t>
+      </w:r>
+    </w:p>
+    <w:p>
+      <w:pPr>
+        <w:pStyle w:val="ListBullet"/>
+        <w:bidi/>
+        <w:jc w:val="right"/>
+      </w:pPr>
+      <w:r>
+        <w:rPr>
+          <w:b/>
+          <w:rtl/>
+          <w:cs/>
+        </w:rPr>
+        <w:t>+ KYC</w:t>
+      </w:r>
+      <w:r>
+        <w:rPr>
+          <w:rtl/>
+          <w:cs/>
+        </w:rPr>
+        <w:t xml:space="preserve"> — מוסיף </w:t>
+      </w:r>
+      <w:r>
+        <w:rPr>
+          <w:b/>
+          <w:rtl/>
+          <w:cs/>
+        </w:rPr>
+        <w:t>שלב אימות זהות</w:t>
+      </w:r>
+      <w:r>
+        <w:rPr>
+          <w:rtl/>
+          <w:cs/>
+        </w:rPr>
+        <w:t xml:space="preserve"> לפני Capture: OTP / צילום ת"ז / וידאו דרך ספק → kyc_ref נשמר ונכנס ל-Bind + לתעודה.</w:t>
+      </w:r>
+    </w:p>
+    <w:p>
+      <w:pPr>
+        <w:pStyle w:val="ListBullet"/>
+        <w:bidi/>
+        <w:jc w:val="right"/>
+      </w:pPr>
+      <w:r>
+        <w:rPr>
+          <w:b/>
+          <w:rtl/>
+          <w:cs/>
+        </w:rPr>
+        <w:t>QES</w:t>
+      </w:r>
+      <w:r>
+        <w:rPr>
+          <w:rtl/>
+          <w:cs/>
+        </w:rPr>
+        <w:t xml:space="preserve"> — </w:t>
+      </w:r>
+      <w:r>
+        <w:rPr>
+          <w:b/>
+          <w:rtl/>
+          <w:cs/>
+        </w:rPr>
+        <w:t>handoff ל-ComSign/QTSP</w:t>
+      </w:r>
+      <w:r>
+        <w:rPr>
+          <w:rtl/>
+          <w:cs/>
+        </w:rPr>
+        <w:t xml:space="preserve"> דרך API: הם מנפיקים תעודה וחותמים חתימה מבוססת-תעודה (PAdES-QES); הפלטפורמה מתזמרת בלבד, לא מנפיקה. cert_ref נשמר.</w:t>
+      </w:r>
+    </w:p>
+    <w:p>
+      <w:pPr>
+        <w:bidi/>
+        <w:jc w:val="right"/>
+      </w:pPr>
+      <w:r>
+        <w:rPr>
+          <w:b/>
+          <w:rtl/>
+          <w:cs/>
+        </w:rPr>
+        <w:t>Certificate of Completion</w:t>
+      </w:r>
+      <w:r>
+        <w:rPr>
+          <w:rtl/>
+          <w:cs/>
+        </w:rPr>
+        <w:t xml:space="preserve"> — PDF נלווה שמרכז: כל האירועים (sent/viewed/consent/signed/reminded) עם actor+IP+UA+timestamp, שיטת החתימה per-חותם, וה-hash. מצורף לחוזה הסופי ובכספת.</w:t>
+      </w:r>
+    </w:p>
+    <w:p>
+      <w:pPr>
+        <w:bidi/>
+        <w:jc w:val="right"/>
+      </w:pPr>
+      <w:r>
+        <w:rPr>
+          <w:b/>
+          <w:rtl/>
+          <w:cs/>
+        </w:rPr>
+        <w:t>מודל נתונים (§5):</w:t>
+      </w:r>
+      <w:r>
+        <w:rPr>
+          <w:rtl/>
+          <w:cs/>
+        </w:rPr>
+        <w:t xml:space="preserve"> signatures(signature_data, doc_hash, ip, device, auth_method, kyc_ref, cert_ref) · signature_events(document_id, event, actor, ip, ua, timestamp).</w:t>
+      </w:r>
+    </w:p>
+    <w:p>
+      <w:pPr>
+        <w:bidi/>
+        <w:jc w:val="right"/>
+      </w:pPr>
+      <w:r>
+        <w:rPr>
+          <w:b/>
+          <w:rtl/>
+          <w:cs/>
+        </w:rPr>
+        <w:t>תקינה:</w:t>
+      </w:r>
+      <w:r>
+        <w:rPr>
+          <w:rtl/>
+          <w:cs/>
+        </w:rPr>
+        <w:t xml:space="preserve"> מיושר לרמות eIDAS (SES/AES/QES) ולחוק חתימה אלקטרונית 2001 (מאובטחת/מאושרת). PAdES לשיבוץ ב-PDF ברמות הגבוהות. אין בניית PKI עצמית — QES תמיד דרך גורם מאשר.</w:t>
+      </w:r>
+    </w:p>
+    <w:p>
+      <w:pPr>
         <w:pStyle w:val="Heading3"/>
         <w:bidi/>
         <w:jc w:val="right"/>
@@ -3045,7 +3932,7 @@
                 <w:rtl/>
                 <w:cs/>
               </w:rPr>
-              <w:t>id, owner_id, workspace_id, title, type (contract/nda/quote/form), status (draft/sent/viewed/signed/completed), body, fields[]</w:t>
+              <w:t>id, owner_id, workspace_id, title, type (contract/nda/quote/form), status (draft/sent/viewed/in_progress/completed/declined/expired/voided), body, fields[], doc_hash, expires_at</w:t>
             </w:r>
           </w:p>
         </w:tc>
@@ -3083,7 +3970,7 @@
                 <w:rtl/>
                 <w:cs/>
               </w:rPr>
-              <w:t>id, workspace_id (או global), name, vertical, body, is_ai_generated, lang</w:t>
+              <w:t>id, workspace_id (או global), name, vertical, body (schema §3.3.1), anchor_mode (coord/text), is_ai_generated, source (prebuilt/ai/upload), lang</w:t>
             </w:r>
           </w:p>
         </w:tc>
@@ -3121,7 +4008,7 @@
                 <w:rtl/>
                 <w:cs/>
               </w:rPr>
-              <w:t>id, document_id, name, contact, channel (email/sms/whatsapp), order, sign_level (simple/kyc/qes), status, signed_at</w:t>
+              <w:t>id, document_id, name, contact, channel (email/sms/whatsapp), order, sign_level (simple/kyc/qes), sign_token, status, signed_at</w:t>
             </w:r>
           </w:p>
         </w:tc>
@@ -3159,7 +4046,7 @@
                 <w:rtl/>
                 <w:cs/>
               </w:rPr>
-              <w:t>id, document_id, signer_id, signature_data, ip, device, audit_hash, kyc_ref</w:t>
+              <w:t>id, document_id, signer_id, signature_data, doc_hash, ip, device/ua, auth_method, kyc_ref, cert_ref</w:t>
             </w:r>
           </w:p>
         </w:tc>
@@ -3197,7 +4084,7 @@
                 <w:rtl/>
                 <w:cs/>
               </w:rPr>
-              <w:t>document_id, event (sent/viewed/signed/reminded), actor, ip, timestamp</w:t>
+              <w:t>document_id, event (sent/viewed/consent/signed/reminded/declined), actor, ip, ua, timestamp</w:t>
             </w:r>
           </w:p>
         </w:tc>

</xml_diff>

<commit_message>
docs(product-8): spec AI generator (§3.3.2), Sign & Pay (§3.6.1), Vault (§3.7.1)
All three relevant; specced at build depth with relevance/phase notes:
- §3.3.2 AI Contract Generator (differentiator, phase 2): prompt intake →
  Claude+baldiga generation w/ auto merge-fields → block-level edit → save;
  mandatory baldiga proofread pass; legal guardrails (disclaimer, high-risk
  clause flagging, no enforceability claims).
- §3.6.1 Sign & Pay (Business tier, phase 5, not MVP): payment field → embedded
  pay step → reconciliation; provider adapter (Stripe + IL processors), PCI via
  hosted fields, failed-payment keeps signature valid.
- §3.7.1 Vault (core/MVP): auto-store encrypted signed PDF + certificate, tag/
  search, time-limited signed-URL access, immutable originals w/ hash verify,
  retention + right-to-delete.

Co-Authored-By: Claude Opus 4.8 (1M context) <noreply@anthropic.com>
</commit_message>
<xml_diff>
--- a/PRODUCTS/08-helix-sign-forms.docx
+++ b/PRODUCTS/08-helix-sign-forms.docx
@@ -2028,6 +2028,269 @@
     </w:p>
     <w:p>
       <w:pPr>
+        <w:pStyle w:val="Heading4"/>
+        <w:bidi/>
+        <w:jc w:val="right"/>
+      </w:pPr>
+      <w:r>
+        <w:rPr>
+          <w:rtl/>
+          <w:cs/>
+        </w:rPr>
+        <w:t>3.3.2 AI Contract Generator — זרימה מלאה (spec לבנייה) 🛠️</w:t>
+      </w:r>
+    </w:p>
+    <w:p>
+      <w:pPr>
+        <w:bidi/>
+        <w:jc w:val="right"/>
+      </w:pPr>
+      <w:r>
+        <w:rPr>
+          <w:b/>
+          <w:rtl/>
+          <w:cs/>
+        </w:rPr>
+        <w:t>רלוונטיות:</w:t>
+      </w:r>
+      <w:r>
+        <w:rPr>
+          <w:rtl/>
+          <w:cs/>
+        </w:rPr>
+        <w:t xml:space="preserve"> בידול מרכזי (תשתית HELIX קיימת). פאזה 2. </w:t>
+      </w:r>
+      <w:r>
+        <w:rPr>
+          <w:b/>
+          <w:rtl/>
+          <w:cs/>
+        </w:rPr>
+        <w:t>מנוף:</w:t>
+      </w:r>
+      <w:r>
+        <w:rPr>
+          <w:rtl/>
+          <w:cs/>
+        </w:rPr>
+        <w:t xml:space="preserve"> Claude+baldiga לעברית משפטית, Ollama לנפח/וריאציות.</w:t>
+      </w:r>
+    </w:p>
+    <w:p>
+      <w:pPr>
+        <w:bidi/>
+        <w:jc w:val="right"/>
+      </w:pPr>
+      <w:r>
+        <w:rPr>
+          <w:b/>
+          <w:rtl/>
+          <w:cs/>
+        </w:rPr>
+        <w:t>זרימה (4 שלבים):</w:t>
+      </w:r>
+    </w:p>
+    <w:p>
+      <w:pPr>
+        <w:pStyle w:val="ListNumber"/>
+        <w:bidi/>
+        <w:jc w:val="right"/>
+      </w:pPr>
+      <w:r>
+        <w:rPr>
+          <w:b/>
+          <w:rtl/>
+          <w:cs/>
+        </w:rPr>
+        <w:t>Prompt intake</w:t>
+      </w:r>
+      <w:r>
+        <w:rPr>
+          <w:rtl/>
+          <w:cs/>
+        </w:rPr>
+        <w:t xml:space="preserve"> — חופשי ("הסכם שירות בין X ל-Y, שוטף+30, סעיף סודיות") או </w:t>
+      </w:r>
+      <w:r>
+        <w:rPr>
+          <w:b/>
+          <w:rtl/>
+          <w:cs/>
+        </w:rPr>
+        <w:t>טופס מובנה</w:t>
+      </w:r>
+      <w:r>
+        <w:rPr>
+          <w:rtl/>
+          <w:cs/>
+        </w:rPr>
+        <w:t xml:space="preserve"> (סוג חוזה · צדדים · תנאים · תמורה). המבנה מוזרק לתבנית-פרומפט per-סוג-חוזה.</w:t>
+      </w:r>
+    </w:p>
+    <w:p>
+      <w:pPr>
+        <w:pStyle w:val="ListNumber"/>
+        <w:bidi/>
+        <w:jc w:val="right"/>
+      </w:pPr>
+      <w:r>
+        <w:rPr>
+          <w:b/>
+          <w:rtl/>
+          <w:cs/>
+        </w:rPr>
+        <w:t>Generation</w:t>
+      </w:r>
+      <w:r>
+        <w:rPr>
+          <w:rtl/>
+          <w:cs/>
+        </w:rPr>
+        <w:t xml:space="preserve"> — </w:t>
+      </w:r>
+      <w:r>
+        <w:rPr>
+          <w:b/>
+          <w:rtl/>
+          <w:cs/>
+        </w:rPr>
+        <w:t>Claude</w:t>
+      </w:r>
+      <w:r>
+        <w:rPr>
+          <w:rtl/>
+          <w:cs/>
+        </w:rPr>
+        <w:t xml:space="preserve"> מנסח חוזה מובנה: סעיפים כבלוקים + </w:t>
+      </w:r>
+      <w:r>
+        <w:rPr>
+          <w:b/>
+          <w:rtl/>
+          <w:cs/>
+        </w:rPr>
+        <w:t>זיהוי אוטומטי של merge-fields</w:t>
+      </w:r>
+      <w:r>
+        <w:rPr>
+          <w:rtl/>
+          <w:cs/>
+        </w:rPr>
+        <w:t xml:space="preserve"> ({{שם_צד_א}}, {{סכום}}). Ollama לטיוטות זולות/וריאציות. </w:t>
+      </w:r>
+      <w:r>
+        <w:rPr>
+          <w:b/>
+          <w:rtl/>
+          <w:cs/>
+        </w:rPr>
+        <w:t>חובה: pass הגהה של baldiga</w:t>
+      </w:r>
+      <w:r>
+        <w:rPr>
+          <w:rtl/>
+          <w:cs/>
+        </w:rPr>
+        <w:t xml:space="preserve"> (baldiga ידוע בשגיאות איות — תמיד proofread אחריו).</w:t>
+      </w:r>
+    </w:p>
+    <w:p>
+      <w:pPr>
+        <w:pStyle w:val="ListNumber"/>
+        <w:bidi/>
+        <w:jc w:val="right"/>
+      </w:pPr>
+      <w:r>
+        <w:rPr>
+          <w:b/>
+          <w:rtl/>
+          <w:cs/>
+        </w:rPr>
+        <w:t>Review &amp; edit</w:t>
+      </w:r>
+      <w:r>
+        <w:rPr>
+          <w:rtl/>
+          <w:cs/>
+        </w:rPr>
+        <w:t xml:space="preserve"> — המשתמש עורך ב-builder; כל </w:t>
+      </w:r>
+      <w:r>
+        <w:rPr>
+          <w:b/>
+          <w:rtl/>
+          <w:cs/>
+        </w:rPr>
+        <w:t>סעיף = בלוק</w:t>
+      </w:r>
+      <w:r>
+        <w:rPr>
+          <w:rtl/>
+          <w:cs/>
+        </w:rPr>
+        <w:t xml:space="preserve"> שאפשר לנסח-מחדש/למחוק/להוסיף ("נסח לי מחדש את סעיף הסיום").</w:t>
+      </w:r>
+    </w:p>
+    <w:p>
+      <w:pPr>
+        <w:pStyle w:val="ListNumber"/>
+        <w:bidi/>
+        <w:jc w:val="right"/>
+      </w:pPr>
+      <w:r>
+        <w:rPr>
+          <w:b/>
+          <w:rtl/>
+          <w:cs/>
+        </w:rPr>
+        <w:t>Save</w:t>
+      </w:r>
+      <w:r>
+        <w:rPr>
+          <w:rtl/>
+          <w:cs/>
+        </w:rPr>
+        <w:t xml:space="preserve"> — נשמר בספרייה הפרטית כתבנית (source=ai), שדות כבר ממופים → מוכן לשליחה.</w:t>
+      </w:r>
+    </w:p>
+    <w:p>
+      <w:pPr>
+        <w:bidi/>
+        <w:jc w:val="right"/>
+      </w:pPr>
+      <w:r>
+        <w:rPr>
+          <w:b/>
+          <w:rtl/>
+          <w:cs/>
+        </w:rPr>
+        <w:t>Guardrails (קריטי — קטגוריה משפטית):</w:t>
+      </w:r>
+      <w:r>
+        <w:rPr>
+          <w:rtl/>
+          <w:cs/>
+        </w:rPr>
+        <w:t xml:space="preserve"> disclaimer חובה ("טיוטה, לא ייעוץ משפטי") · </w:t>
+      </w:r>
+      <w:r>
+        <w:rPr>
+          <w:b/>
+          <w:rtl/>
+          <w:cs/>
+        </w:rPr>
+        <w:t>סימון סעיפים בסיכון גבוה</w:t>
+      </w:r>
+      <w:r>
+        <w:rPr>
+          <w:rtl/>
+          <w:cs/>
+        </w:rPr>
+        <w:t xml:space="preserve"> ("מומלץ עו"ד") · אף פעם לא טוענים אכיפות · jurisdiction = ישראל כברירת מחדל · שמירת metadata של הג'נרציה (prompt, model, גרסה).</w:t>
+      </w:r>
+    </w:p>
+    <w:p>
+      <w:pPr>
         <w:pStyle w:val="Heading3"/>
         <w:bidi/>
         <w:jc w:val="right"/>
@@ -3487,6 +3750,321 @@
     </w:p>
     <w:p>
       <w:pPr>
+        <w:pStyle w:val="Heading4"/>
+        <w:bidi/>
+        <w:jc w:val="right"/>
+      </w:pPr>
+      <w:r>
+        <w:rPr>
+          <w:rtl/>
+          <w:cs/>
+        </w:rPr>
+        <w:t>3.6.1 Sign &amp; Pay — זרימה מלאה (spec לבנייה) 🛠️</w:t>
+      </w:r>
+    </w:p>
+    <w:p>
+      <w:pPr>
+        <w:bidi/>
+        <w:jc w:val="right"/>
+      </w:pPr>
+      <w:r>
+        <w:rPr>
+          <w:b/>
+          <w:rtl/>
+          <w:cs/>
+        </w:rPr>
+        <w:t>רלוונטיות:</w:t>
+      </w:r>
+      <w:r>
+        <w:rPr>
+          <w:rtl/>
+          <w:cs/>
+        </w:rPr>
+        <w:t xml:space="preserve"> רלוונטי (פרילנסר/נותן-שירות גובה מקדמה עם החוזה; הצעת מחיר → תשלום). </w:t>
+      </w:r>
+      <w:r>
+        <w:rPr>
+          <w:b/>
+          <w:rtl/>
+          <w:cs/>
+        </w:rPr>
+        <w:t>tier עסק+, פאזה 5</w:t>
+      </w:r>
+      <w:r>
+        <w:rPr>
+          <w:rtl/>
+          <w:cs/>
+        </w:rPr>
+        <w:t xml:space="preserve"> — לא MVP.</w:t>
+      </w:r>
+    </w:p>
+    <w:p>
+      <w:pPr>
+        <w:bidi/>
+        <w:jc w:val="right"/>
+      </w:pPr>
+      <w:r>
+        <w:rPr>
+          <w:b/>
+          <w:rtl/>
+          <w:cs/>
+        </w:rPr>
+        <w:t>זרימה (3 שלבים):</w:t>
+      </w:r>
+    </w:p>
+    <w:p>
+      <w:pPr>
+        <w:pStyle w:val="ListNumber"/>
+        <w:bidi/>
+        <w:jc w:val="right"/>
+      </w:pPr>
+      <w:r>
+        <w:rPr>
+          <w:b/>
+          <w:rtl/>
+          <w:cs/>
+        </w:rPr>
+        <w:t>הגדרה</w:t>
+      </w:r>
+      <w:r>
+        <w:rPr>
+          <w:rtl/>
+          <w:cs/>
+        </w:rPr>
+        <w:t xml:space="preserve"> — מוסיפים </w:t>
+      </w:r>
+      <w:r>
+        <w:rPr>
+          <w:b/>
+          <w:rtl/>
+          <w:cs/>
+        </w:rPr>
+        <w:t>שדה תשלום</w:t>
+      </w:r>
+      <w:r>
+        <w:rPr>
+          <w:rtl/>
+          <w:cs/>
+        </w:rPr>
+        <w:t xml:space="preserve"> למסמך: סכום (קבוע/מחושב §3.2), מטבע, תיאור, ותזמון (</w:t>
+      </w:r>
+      <w:r>
+        <w:rPr>
+          <w:b/>
+          <w:rtl/>
+          <w:cs/>
+        </w:rPr>
+        <w:t>בחתימה</w:t>
+      </w:r>
+      <w:r>
+        <w:rPr>
+          <w:rtl/>
+          <w:cs/>
+        </w:rPr>
+        <w:t xml:space="preserve"> / מקדמה % / לאחר).</w:t>
+      </w:r>
+    </w:p>
+    <w:p>
+      <w:pPr>
+        <w:pStyle w:val="ListNumber"/>
+        <w:bidi/>
+        <w:jc w:val="right"/>
+      </w:pPr>
+      <w:r>
+        <w:rPr>
+          <w:b/>
+          <w:rtl/>
+          <w:cs/>
+        </w:rPr>
+        <w:t>תשלום החותם</w:t>
+      </w:r>
+      <w:r>
+        <w:rPr>
+          <w:rtl/>
+          <w:cs/>
+        </w:rPr>
+        <w:t xml:space="preserve"> — אחרי החתימה → שלב תשלום </w:t>
+      </w:r>
+      <w:r>
+        <w:rPr>
+          <w:b/>
+          <w:rtl/>
+          <w:cs/>
+        </w:rPr>
+        <w:t>משובץ/redirect</w:t>
+      </w:r>
+      <w:r>
+        <w:rPr>
+          <w:rtl/>
+          <w:cs/>
+        </w:rPr>
+        <w:t xml:space="preserve"> (שדות מתארחים אצל הספק) → כרטיס → שולם.</w:t>
+      </w:r>
+    </w:p>
+    <w:p>
+      <w:pPr>
+        <w:pStyle w:val="ListNumber"/>
+        <w:bidi/>
+        <w:jc w:val="right"/>
+      </w:pPr>
+      <w:r>
+        <w:rPr>
+          <w:b/>
+          <w:rtl/>
+          <w:cs/>
+        </w:rPr>
+        <w:t>התאמה (reconciliation)</w:t>
+      </w:r>
+      <w:r>
+        <w:rPr>
+          <w:rtl/>
+          <w:cs/>
+        </w:rPr>
+        <w:t xml:space="preserve"> — התשלום נקשר ל-document_id + signer_id; סטטוס; קבלה אוטומטית; שני הצדדים מקבלים אישור.</w:t>
+      </w:r>
+    </w:p>
+    <w:p>
+      <w:pPr>
+        <w:bidi/>
+        <w:jc w:val="right"/>
+      </w:pPr>
+      <w:r>
+        <w:rPr>
+          <w:b/>
+          <w:rtl/>
+          <w:cs/>
+        </w:rPr>
+        <w:t>טכני:</w:t>
+      </w:r>
+    </w:p>
+    <w:p>
+      <w:pPr>
+        <w:pStyle w:val="ListBullet"/>
+        <w:bidi/>
+        <w:jc w:val="right"/>
+      </w:pPr>
+      <w:r>
+        <w:rPr>
+          <w:b/>
+          <w:rtl/>
+          <w:cs/>
+        </w:rPr>
+        <w:t>הפשטת ספק (adapter):</w:t>
+      </w:r>
+      <w:r>
+        <w:rPr>
+          <w:rtl/>
+          <w:cs/>
+        </w:rPr>
+        <w:t xml:space="preserve"> </w:t>
+      </w:r>
+      <w:r>
+        <w:rPr>
+          <w:b/>
+          <w:rtl/>
+          <w:cs/>
+        </w:rPr>
+        <w:t>Stripe</w:t>
+      </w:r>
+      <w:r>
+        <w:rPr>
+          <w:rtl/>
+          <w:cs/>
+        </w:rPr>
+        <w:t xml:space="preserve"> (גלובלי) + </w:t>
+      </w:r>
+      <w:r>
+        <w:rPr>
+          <w:b/>
+          <w:rtl/>
+          <w:cs/>
+        </w:rPr>
+        <w:t>סליקה ישראלית</w:t>
+      </w:r>
+      <w:r>
+        <w:rPr>
+          <w:rtl/>
+          <w:cs/>
+        </w:rPr>
+        <w:t xml:space="preserve"> (Tranzila / Cardcom / Meshulam / Grow) מאחורי interface אחיד.</w:t>
+      </w:r>
+    </w:p>
+    <w:p>
+      <w:pPr>
+        <w:pStyle w:val="ListBullet"/>
+        <w:bidi/>
+        <w:jc w:val="right"/>
+      </w:pPr>
+      <w:r>
+        <w:rPr>
+          <w:b/>
+          <w:rtl/>
+          <w:cs/>
+        </w:rPr>
+        <w:t>PCI:</w:t>
+      </w:r>
+      <w:r>
+        <w:rPr>
+          <w:rtl/>
+          <w:cs/>
+        </w:rPr>
+        <w:t xml:space="preserve"> אף פעם לא שומרים כרטיס — hosted fields / redirect בלבד. webhook מאשר → edge function → payments.</w:t>
+      </w:r>
+    </w:p>
+    <w:p>
+      <w:pPr>
+        <w:pStyle w:val="ListBullet"/>
+        <w:bidi/>
+        <w:jc w:val="right"/>
+      </w:pPr>
+      <w:r>
+        <w:rPr>
+          <w:b/>
+          <w:rtl/>
+          <w:cs/>
+        </w:rPr>
+        <w:t>קצוות:</w:t>
+      </w:r>
+      <w:r>
+        <w:rPr>
+          <w:rtl/>
+          <w:cs/>
+        </w:rPr>
+        <w:t xml:space="preserve"> מקדמה/תשלום חלקי · refund · </w:t>
+      </w:r>
+      <w:r>
+        <w:rPr>
+          <w:b/>
+          <w:rtl/>
+          <w:cs/>
+        </w:rPr>
+        <w:t>תשלום נכשל</w:t>
+      </w:r>
+      <w:r>
+        <w:rPr>
+          <w:rtl/>
+          <w:cs/>
+        </w:rPr>
+        <w:t xml:space="preserve"> → </w:t>
+      </w:r>
+      <w:r>
+        <w:rPr>
+          <w:b/>
+          <w:rtl/>
+          <w:cs/>
+        </w:rPr>
+        <w:t>החתימה תקפה, התשלום ב-pending</w:t>
+      </w:r>
+      <w:r>
+        <w:rPr>
+          <w:rtl/>
+          <w:cs/>
+        </w:rPr>
+        <w:t xml:space="preserve"> (לא חוסמים חוזה חתום על כשל סליקה).</w:t>
+      </w:r>
+    </w:p>
+    <w:p>
+      <w:pPr>
         <w:pStyle w:val="Heading3"/>
         <w:bidi/>
         <w:jc w:val="right"/>
@@ -3547,6 +4125,395 @@
           <w:cs/>
         </w:rPr>
         <w:t>ייצוא PDF חתום + certificate of completion.</w:t>
+      </w:r>
+    </w:p>
+    <w:p>
+      <w:pPr>
+        <w:pStyle w:val="Heading4"/>
+        <w:bidi/>
+        <w:jc w:val="right"/>
+      </w:pPr>
+      <w:r>
+        <w:rPr>
+          <w:rtl/>
+          <w:cs/>
+        </w:rPr>
+        <w:t>3.7.1 Vault — זרימה מלאה (spec לבנייה) 🛠️</w:t>
+      </w:r>
+    </w:p>
+    <w:p>
+      <w:pPr>
+        <w:bidi/>
+        <w:jc w:val="right"/>
+      </w:pPr>
+      <w:r>
+        <w:rPr>
+          <w:b/>
+          <w:rtl/>
+          <w:cs/>
+        </w:rPr>
+        <w:t>רלוונטיות:</w:t>
+      </w:r>
+      <w:r>
+        <w:rPr>
+          <w:rtl/>
+          <w:cs/>
+        </w:rPr>
+        <w:t xml:space="preserve"> </w:t>
+      </w:r>
+      <w:r>
+        <w:rPr>
+          <w:b/>
+          <w:rtl/>
+          <w:cs/>
+        </w:rPr>
+        <w:t>core / MVP.</w:t>
+      </w:r>
+      <w:r>
+        <w:rPr>
+          <w:rtl/>
+          <w:cs/>
+        </w:rPr>
+        <w:t xml:space="preserve"> חובה משפטית — חייבים לשמור את המסמך החתום + audit כראיה, מהיום הראשון.</w:t>
+      </w:r>
+    </w:p>
+    <w:p>
+      <w:pPr>
+        <w:bidi/>
+        <w:jc w:val="right"/>
+      </w:pPr>
+      <w:r>
+        <w:rPr>
+          <w:b/>
+          <w:rtl/>
+          <w:cs/>
+        </w:rPr>
+        <w:t>זרימה (4 שלבים):</w:t>
+      </w:r>
+    </w:p>
+    <w:p>
+      <w:pPr>
+        <w:pStyle w:val="ListNumber"/>
+        <w:bidi/>
+        <w:jc w:val="right"/>
+      </w:pPr>
+      <w:r>
+        <w:rPr>
+          <w:b/>
+          <w:rtl/>
+          <w:cs/>
+        </w:rPr>
+        <w:t>אחסון אוטומטי</w:t>
+      </w:r>
+      <w:r>
+        <w:rPr>
+          <w:rtl/>
+          <w:cs/>
+        </w:rPr>
+        <w:t xml:space="preserve"> — כל מסמך שהושלם → </w:t>
+      </w:r>
+      <w:r>
+        <w:rPr>
+          <w:b/>
+          <w:rtl/>
+          <w:cs/>
+        </w:rPr>
+        <w:t>signed PDF + Certificate of Completion</w:t>
+      </w:r>
+      <w:r>
+        <w:rPr>
+          <w:rtl/>
+          <w:cs/>
+        </w:rPr>
+        <w:t xml:space="preserve"> נכנסים לכספת, </w:t>
+      </w:r>
+      <w:r>
+        <w:rPr>
+          <w:b/>
+          <w:rtl/>
+          <w:cs/>
+        </w:rPr>
+        <w:t>מוצפנים</w:t>
+      </w:r>
+      <w:r>
+        <w:rPr>
+          <w:rtl/>
+          <w:cs/>
+        </w:rPr>
+        <w:t>.</w:t>
+      </w:r>
+    </w:p>
+    <w:p>
+      <w:pPr>
+        <w:pStyle w:val="ListNumber"/>
+        <w:bidi/>
+        <w:jc w:val="right"/>
+      </w:pPr>
+      <w:r>
+        <w:rPr>
+          <w:b/>
+          <w:rtl/>
+          <w:cs/>
+        </w:rPr>
+        <w:t>ארגון</w:t>
+      </w:r>
+      <w:r>
+        <w:rPr>
+          <w:rtl/>
+          <w:cs/>
+        </w:rPr>
+        <w:t xml:space="preserve"> — תיקיות/תגיות + </w:t>
+      </w:r>
+      <w:r>
+        <w:rPr>
+          <w:b/>
+          <w:rtl/>
+          <w:cs/>
+        </w:rPr>
+        <w:t>חיפוש</w:t>
+      </w:r>
+      <w:r>
+        <w:rPr>
+          <w:rtl/>
+          <w:cs/>
+        </w:rPr>
+        <w:t xml:space="preserve"> (לפי צד, תאריך, סוג, סטטוס) + פילטרים.</w:t>
+      </w:r>
+    </w:p>
+    <w:p>
+      <w:pPr>
+        <w:pStyle w:val="ListNumber"/>
+        <w:bidi/>
+        <w:jc w:val="right"/>
+      </w:pPr>
+      <w:r>
+        <w:rPr>
+          <w:b/>
+          <w:rtl/>
+          <w:cs/>
+        </w:rPr>
+        <w:t>אחזור/ייצוא</w:t>
+      </w:r>
+      <w:r>
+        <w:rPr>
+          <w:rtl/>
+          <w:cs/>
+        </w:rPr>
+        <w:t xml:space="preserve"> — הורדת PDF חתום + certificate · </w:t>
+      </w:r>
+      <w:r>
+        <w:rPr>
+          <w:b/>
+          <w:rtl/>
+          <w:cs/>
+        </w:rPr>
+        <w:t>קישור-צפייה read-only</w:t>
+      </w:r>
+      <w:r>
+        <w:rPr>
+          <w:rtl/>
+          <w:cs/>
+        </w:rPr>
+        <w:t xml:space="preserve"> (מוגבל-זמן) לשיתוף · ייצוא bulk.</w:t>
+      </w:r>
+    </w:p>
+    <w:p>
+      <w:pPr>
+        <w:pStyle w:val="ListNumber"/>
+        <w:bidi/>
+        <w:jc w:val="right"/>
+      </w:pPr>
+      <w:r>
+        <w:rPr>
+          <w:b/>
+          <w:rtl/>
+          <w:cs/>
+        </w:rPr>
+        <w:t>מחזור-חיים</w:t>
+      </w:r>
+      <w:r>
+        <w:rPr>
+          <w:rtl/>
+          <w:cs/>
+        </w:rPr>
+        <w:t xml:space="preserve"> — מדיניות שמירה (retention) · </w:t>
+      </w:r>
+      <w:r>
+        <w:rPr>
+          <w:b/>
+          <w:rtl/>
+          <w:cs/>
+        </w:rPr>
+        <w:t>תזכורת פקיעת-חוזה</w:t>
+      </w:r>
+      <w:r>
+        <w:rPr>
+          <w:rtl/>
+          <w:cs/>
+        </w:rPr>
+        <w:t xml:space="preserve"> (מתאריך סיום) · היסטוריית גרסאות · legal-hold.</w:t>
+      </w:r>
+    </w:p>
+    <w:p>
+      <w:pPr>
+        <w:bidi/>
+        <w:jc w:val="right"/>
+      </w:pPr>
+      <w:r>
+        <w:rPr>
+          <w:b/>
+          <w:rtl/>
+          <w:cs/>
+        </w:rPr>
+        <w:t>טכני:</w:t>
+      </w:r>
+    </w:p>
+    <w:p>
+      <w:pPr>
+        <w:pStyle w:val="ListBullet"/>
+        <w:bidi/>
+        <w:jc w:val="right"/>
+      </w:pPr>
+      <w:r>
+        <w:rPr>
+          <w:b/>
+          <w:rtl/>
+          <w:cs/>
+        </w:rPr>
+        <w:t>אחסון:</w:t>
+      </w:r>
+      <w:r>
+        <w:rPr>
+          <w:rtl/>
+          <w:cs/>
+        </w:rPr>
+        <w:t xml:space="preserve"> Supabase Storage, bucket מוצפן, </w:t>
+      </w:r>
+      <w:r>
+        <w:rPr>
+          <w:b/>
+          <w:rtl/>
+          <w:cs/>
+        </w:rPr>
+        <w:t>RLS per-workspace</w:t>
+      </w:r>
+      <w:r>
+        <w:rPr>
+          <w:rtl/>
+          <w:cs/>
+        </w:rPr>
+        <w:t>; מטא ב-vault_files (§5).</w:t>
+      </w:r>
+    </w:p>
+    <w:p>
+      <w:pPr>
+        <w:pStyle w:val="ListBullet"/>
+        <w:bidi/>
+        <w:jc w:val="right"/>
+      </w:pPr>
+      <w:r>
+        <w:rPr>
+          <w:b/>
+          <w:rtl/>
+          <w:cs/>
+        </w:rPr>
+        <w:t>גישה:</w:t>
+      </w:r>
+      <w:r>
+        <w:rPr>
+          <w:rtl/>
+          <w:cs/>
+        </w:rPr>
+        <w:t xml:space="preserve"> </w:t>
+      </w:r>
+      <w:r>
+        <w:rPr>
+          <w:b/>
+          <w:rtl/>
+          <w:cs/>
+        </w:rPr>
+        <w:t>signed URLs מוגבלי-זמן</w:t>
+      </w:r>
+      <w:r>
+        <w:rPr>
+          <w:rtl/>
+          <w:cs/>
+        </w:rPr>
+        <w:t xml:space="preserve"> בלבד (לא public); כל גישה מתועדת (audit).</w:t>
+      </w:r>
+    </w:p>
+    <w:p>
+      <w:pPr>
+        <w:pStyle w:val="ListBullet"/>
+        <w:bidi/>
+        <w:jc w:val="right"/>
+      </w:pPr>
+      <w:r>
+        <w:rPr>
+          <w:b/>
+          <w:rtl/>
+          <w:cs/>
+        </w:rPr>
+        <w:t>חסינות משפטית:</w:t>
+      </w:r>
+      <w:r>
+        <w:rPr>
+          <w:rtl/>
+          <w:cs/>
+        </w:rPr>
+        <w:t xml:space="preserve"> המקור החתום </w:t>
+      </w:r>
+      <w:r>
+        <w:rPr>
+          <w:b/>
+          <w:rtl/>
+          <w:cs/>
+        </w:rPr>
+        <w:t>immutable</w:t>
+      </w:r>
+      <w:r>
+        <w:rPr>
+          <w:rtl/>
+          <w:cs/>
+        </w:rPr>
+        <w:t xml:space="preserve"> — אי-אפשר לערוך, רק ליצור מסמך-חלופי (supersede). ה-doc_hash מאפשר אימות (§3.5.1 Verify).</w:t>
+      </w:r>
+    </w:p>
+    <w:p>
+      <w:pPr>
+        <w:pStyle w:val="ListBullet"/>
+        <w:bidi/>
+        <w:jc w:val="right"/>
+      </w:pPr>
+      <w:r>
+        <w:rPr>
+          <w:b/>
+          <w:rtl/>
+          <w:cs/>
+        </w:rPr>
+        <w:t>פרטיות:</w:t>
+      </w:r>
+      <w:r>
+        <w:rPr>
+          <w:rtl/>
+          <w:cs/>
+        </w:rPr>
+        <w:t xml:space="preserve"> retention מוגדר + </w:t>
+      </w:r>
+      <w:r>
+        <w:rPr>
+          <w:b/>
+          <w:rtl/>
+          <w:cs/>
+        </w:rPr>
+        <w:t>זכות מחיקה</w:t>
+      </w:r>
+      <w:r>
+        <w:rPr>
+          <w:rtl/>
+          <w:cs/>
+        </w:rPr>
+        <w:t xml:space="preserve"> (המסמך מכיל PII) — מחיקה מתועדת, לא שקטה.</w:t>
       </w:r>
     </w:p>
     <w:p>

</xml_diff>